<commit_message>
Reescribir los 4 casos como hoja de mesa: qué pasó, qué entregan y qué no, en voz de instructor.
Co-authored-by: Cursor <cursoragent@cursor.com>
</commit_message>
<xml_diff>
--- a/Caso-01-Calidad-Lote-retenido.docx
+++ b/Caso-01-Calidad-Lote-retenido.docx
@@ -8,17 +8,22 @@
           <w:b/>
           <w:sz w:val="36"/>
         </w:rPr>
-        <w:t>Caso 1 · Lote retenido en Lote Norte</w:t>
+        <w:t>Caso 1 · El lote que no salió</w:t>
       </w:r>
     </w:p>
     <w:p>
       <w:r>
-        <w:t xml:space="preserve">Caso 1 de 4 · Calidad · Oficina + IA · Magnatic</w:t>
+        <w:t xml:space="preserve">Caso 1 de 4  ·  Calidad</w:t>
       </w:r>
     </w:p>
     <w:p>
       <w:r>
-        <w:t xml:space="preserve">Fase A: 40 minutos. Sin IA, sin internet, sin celular-chat. Solo Word, Excel y PowerPoint. Fase B: la misma entrega con ChatGPT o Claude, cronometrada. El proyecto final es individual, sobre el mismo caso de la mesa.</w:t>
+        <w:t xml:space="preserve">Hoy ustedes son el equipo de Calidad. Relájense: esto es de práctica. No usen nada de la planta de verdad.</w:t>
+      </w:r>
+    </w:p>
+    <w:p>
+      <w:r>
+        <w:t xml:space="preserve"/>
       </w:r>
     </w:p>
     <w:p>
@@ -26,12 +31,17 @@
         <w:rPr>
           <w:b/>
         </w:rPr>
-        <w:t xml:space="preserve">Situación</w:t>
+        <w:t xml:space="preserve">Qué pasó</w:t>
       </w:r>
     </w:p>
     <w:p>
       <w:r>
-        <w:t xml:space="preserve">En Lote Norte, línea 2, se observó humedad alta en producto empacado. El lote no salió a mercado. Hoy el primer borrador de no conformidad se arma a mano, tarde y con huecos. Necesito un paquete de práctica (Word + Excel + 4 slides) que un humano de Calidad pueda editar, sin cerrar causa raíz ni citar una ISO con número.</w:t>
+        <w:t xml:space="preserve">En Lote Norte, en la línea 2, alguien notó que el producto empacado estaba más húmedo de lo normal. Pararon el lote. No se fue al mercado. Nadie les dio un porcentaje oficial ni un número de caso. Tienen que dejar un primer aviso para que Calidad lo revise mañana.</w:t>
+      </w:r>
+    </w:p>
+    <w:p>
+      <w:r>
+        <w:t xml:space="preserve"/>
       </w:r>
     </w:p>
     <w:p>
@@ -39,12 +49,27 @@
         <w:rPr>
           <w:b/>
         </w:rPr>
-        <w:t xml:space="preserve">Cómo se hace hoy</w:t>
+        <w:t xml:space="preserve">Qué entregan (las dos veces: a mano y con IA)</w:t>
       </w:r>
     </w:p>
     <w:p>
       <w:r>
-        <w:t xml:space="preserve">Se escribe de memoria, se piden cifras que nadie confirmó y se pierde tiempo armando la tabla y las diapositivas.</w:t>
+        <w:t xml:space="preserve">Word: una página. Qué vieron, qué evidencia inventaron (márquenla como inventada), qué falta preguntar y quién firmaría.</w:t>
+      </w:r>
+    </w:p>
+    <w:p>
+      <w:r>
+        <w:t xml:space="preserve">Excel: 6 filas de práctica. Planta, lote inventado, humedad inventada, turno.</w:t>
+      </w:r>
+    </w:p>
+    <w:p>
+      <w:r>
+        <w:t xml:space="preserve">PowerPoint: 4 diapositivas. Qué pasó, qué vieron, qué no sabemos, qué hace una persona después.</w:t>
+      </w:r>
+    </w:p>
+    <w:p>
+      <w:r>
+        <w:t xml:space="preserve"/>
       </w:r>
     </w:p>
     <w:p>
@@ -52,12 +77,17 @@
         <w:rPr>
           <w:b/>
         </w:rPr>
-        <w:t xml:space="preserve">Entrega (idéntica en Fase A y Fase B)</w:t>
+        <w:t xml:space="preserve">Esto no</w:t>
       </w:r>
     </w:p>
     <w:p>
       <w:r>
-        <w:t xml:space="preserve">Borrador de una página + idea de 6 filas de tabla + esquema de 4 slides para que Calidad edite. Hallazgo / Evidencia / Hipótesis por confirmar / Contención / Datos faltantes / Quién firma.</w:t>
+        <w:t xml:space="preserve">No pongan un número de ISO. No cierren la causa. No inventen una fecha de cierre. Si no lo saben, escríbanlo: no lo sabemos.</w:t>
+      </w:r>
+    </w:p>
+    <w:p>
+      <w:r>
+        <w:t xml:space="preserve"/>
       </w:r>
     </w:p>
     <w:p>
@@ -65,12 +95,27 @@
         <w:rPr>
           <w:b/>
         </w:rPr>
-        <w:t xml:space="preserve">Restricciones</w:t>
+        <w:t xml:space="preserve">Cómo lo hacemos hoy</w:t>
       </w:r>
     </w:p>
     <w:p>
       <w:r>
-        <w:t xml:space="preserve">No inventes ISO con número, causa raíz ni fecha de cierre. Marca [VERIFICAR] cada cifra o cláusula.</w:t>
+        <w:t xml:space="preserve">1. Lean esta hoja juntos, dos minutos. Si no entendieron, pregunten ahora.</w:t>
+      </w:r>
+    </w:p>
+    <w:p>
+      <w:r>
+        <w:t xml:space="preserve">2. 40 minutos. Internet apagado. Sin ChatGPT, Claude ni el celular como chat. Solo Word, Excel y PowerPoint en blanco. Un celular puede ser reloj, nada más.</w:t>
+      </w:r>
+    </w:p>
+    <w:p>
+      <w:r>
+        <w:t xml:space="preserve">3. Luego el mismo trabajo CON IA. Anoten: minutos a mano, minutos con IA, y tres diferencias (qué salió más rápido, qué inventó la máquina, qué quedó más honesto a mano).</w:t>
+      </w:r>
+    </w:p>
+    <w:p>
+      <w:r>
+        <w:t xml:space="preserve"/>
       </w:r>
     </w:p>
     <w:p>
@@ -78,56 +123,22 @@
         <w:rPr>
           <w:b/>
         </w:rPr>
-        <w:t xml:space="preserve">Riesgos típicos</w:t>
+        <w:t xml:space="preserve">Después, cada uno</w:t>
       </w:r>
     </w:p>
     <w:p>
       <w:r>
-        <w:t xml:space="preserve">Cerrar el caso en el chat. Inventar una norma. Tratar la humedad inventada como dato oficial.</w:t>
+        <w:t xml:space="preserve">Abran Proyecto final en el laboratorio, elijan este caso y llenen su ficha. La mesa ensayó. El proyecto es de cada persona. Tres a cinco minutos al frente.</w:t>
       </w:r>
     </w:p>
     <w:p>
       <w:r>
-        <w:rPr>
-          <w:b/>
-        </w:rPr>
-        <w:t xml:space="preserve">Quién controla</w:t>
+        <w:t xml:space="preserve"/>
       </w:r>
     </w:p>
     <w:p>
       <w:r>
-        <w:t xml:space="preserve">La IA propone texto y estructura. Calidad verifica evidencia y firma. Nadie pega registros reales.</w:t>
-      </w:r>
-    </w:p>
-    <w:p>
-      <w:r>
-        <w:rPr>
-          <w:b/>
-        </w:rPr>
-        <w:t xml:space="preserve">Cómo se corre (las dos fases)</w:t>
-      </w:r>
-    </w:p>
-    <w:p>
-      <w:r>
-        <w:t xml:space="preserve">Fase A — 40 minutos. Reloj en la mesa. Cierren internet (modo avión o Wi-Fi apagado). Prohibido ChatGPT, Claude, Copilot, Gemini y el celular como chat. Solo Word, Excel y PowerPoint en blanco. Piensen ustedes. Inventen solo datos de práctica (Planta Central, Lote Norte, Cliente Alfa). Nada de CISA real.</w:t>
-      </w:r>
-    </w:p>
-    <w:p>
-      <w:r>
-        <w:t xml:space="preserve">Fase B — La misma entrega. Ahora sí pueden usar ChatGPT o Claude. Cronometren de nuevo. Anoten minutos A, minutos B y tres diferencias (velocidad, calidad, huecos, riesgos).</w:t>
-      </w:r>
-    </w:p>
-    <w:p>
-      <w:r>
-        <w:rPr>
-          <w:b/>
-        </w:rPr>
-        <w:t xml:space="preserve">Proyecto final (cada persona, no el grupo)</w:t>
-      </w:r>
-    </w:p>
-    <w:p>
-      <w:r>
-        <w:t xml:space="preserve">Después, cada integrante abre Proyecto final en el laboratorio, elige ESTE caso y completa los 7 pasos. La mesa ensayó; la ficha es individual. Presentación de 3 a 5 minutos.</w:t>
+        <w:t xml:space="preserve">Esto es de práctica. Planta Central, Lote Norte, Cliente Alfa. Nada de la empresa de verdad.</w:t>
       </w:r>
     </w:p>
   </w:body>

</xml_diff>

<commit_message>
Separar los 4 casos de mesa del examen y reescribir cada Word de proyectos para el alumno.
Co-authored-by: Cursor <cursoragent@cursor.com>
</commit_message>
<xml_diff>
--- a/Caso-01-Calidad-Lote-retenido.docx
+++ b/Caso-01-Calidad-Lote-retenido.docx
@@ -18,7 +18,17 @@
     </w:p>
     <w:p>
       <w:r>
-        <w:t xml:space="preserve">Hoy ustedes son el equipo de Calidad. Relájense: esto es de práctica. No usen nada de la planta de verdad.</w:t>
+        <w:t xml:space="preserve">Esto es un ejercicio de MESA. No es el proyecto final. El proyecto de cada persona es otro Word, el de la carpeta proyectos.</w:t>
+      </w:r>
+    </w:p>
+    <w:p>
+      <w:r>
+        <w:t xml:space="preserve"/>
+      </w:r>
+    </w:p>
+    <w:p>
+      <w:r>
+        <w:t xml:space="preserve">Hoy ustedes son Calidad. Esto es de práctica. No usen nada de la planta de verdad.</w:t>
       </w:r>
     </w:p>
     <w:p>
@@ -36,7 +46,7 @@
     </w:p>
     <w:p>
       <w:r>
-        <w:t xml:space="preserve">En Lote Norte, en la línea 2, alguien notó que el producto empacado estaba más húmedo de lo normal. Pararon el lote. No se fue al mercado. Nadie les dio un porcentaje oficial ni un número de caso. Tienen que dejar un primer aviso para que Calidad lo revise mañana.</w:t>
+        <w:t xml:space="preserve">En Lote Norte, línea 2, el producto empacado salió más húmedo de lo normal. Pararon el lote. No se fue al mercado. Nadie les dio un porcentaje ni un número de caso.</w:t>
       </w:r>
     </w:p>
     <w:p>
@@ -49,22 +59,22 @@
         <w:rPr>
           <w:b/>
         </w:rPr>
-        <w:t xml:space="preserve">Qué entregan (las dos veces: a mano y con IA)</w:t>
+        <w:t xml:space="preserve">Qué hacen (dos veces: 40 min a mano, luego con IA)</w:t>
       </w:r>
     </w:p>
     <w:p>
       <w:r>
-        <w:t xml:space="preserve">Word: una página. Qué vieron, qué evidencia inventaron (márquenla como inventada), qué falta preguntar y quién firmaría.</w:t>
+        <w:t xml:space="preserve">Word: 1 página. Qué pasó, qué vieron, qué falta preguntar.</w:t>
       </w:r>
     </w:p>
     <w:p>
       <w:r>
-        <w:t xml:space="preserve">Excel: 6 filas de práctica. Planta, lote inventado, humedad inventada, turno.</w:t>
+        <w:t xml:space="preserve">Excel: 6 filas inventadas (planta, lote, humedad, turno).</w:t>
       </w:r>
     </w:p>
     <w:p>
       <w:r>
-        <w:t xml:space="preserve">PowerPoint: 4 diapositivas. Qué pasó, qué vieron, qué no sabemos, qué hace una persona después.</w:t>
+        <w:t xml:space="preserve">PowerPoint: 4 diapositivas.</w:t>
       </w:r>
     </w:p>
     <w:p>
@@ -82,7 +92,7 @@
     </w:p>
     <w:p>
       <w:r>
-        <w:t xml:space="preserve">No pongan un número de ISO. No cierren la causa. No inventen una fecha de cierre. Si no lo saben, escríbanlo: no lo sabemos.</w:t>
+        <w:t xml:space="preserve">No inventen una norma. No digan “ya sabemos la causa”.</w:t>
       </w:r>
     </w:p>
     <w:p>
@@ -95,22 +105,22 @@
         <w:rPr>
           <w:b/>
         </w:rPr>
-        <w:t xml:space="preserve">Cómo lo hacemos hoy</w:t>
+        <w:t xml:space="preserve">Cómo</w:t>
       </w:r>
     </w:p>
     <w:p>
       <w:r>
-        <w:t xml:space="preserve">1. Lean esta hoja juntos, dos minutos. Si no entendieron, pregunten ahora.</w:t>
+        <w:t xml:space="preserve">1. Lean esta hoja. Si no quedó claro, pregunten ahora.</w:t>
       </w:r>
     </w:p>
     <w:p>
       <w:r>
-        <w:t xml:space="preserve">2. 40 minutos. Internet apagado. Sin ChatGPT, Claude ni el celular como chat. Solo Word, Excel y PowerPoint en blanco. Un celular puede ser reloj, nada más.</w:t>
+        <w:t xml:space="preserve">2. 40 minutos. Internet apagado. Sin ChatGPT ni Claude. Solo Word, Excel y PowerPoint en blanco.</w:t>
       </w:r>
     </w:p>
     <w:p>
       <w:r>
-        <w:t xml:space="preserve">3. Luego el mismo trabajo CON IA. Anoten: minutos a mano, minutos con IA, y tres diferencias (qué salió más rápido, qué inventó la máquina, qué quedó más honesto a mano).</w:t>
+        <w:t xml:space="preserve">3. Luego lo mismo CON IA. Anoten minutos a mano, minutos con IA y tres diferencias.</w:t>
       </w:r>
     </w:p>
     <w:p>
@@ -120,25 +130,7 @@
     </w:p>
     <w:p>
       <w:r>
-        <w:rPr>
-          <w:b/>
-        </w:rPr>
-        <w:t xml:space="preserve">Después, cada uno</w:t>
-      </w:r>
-    </w:p>
-    <w:p>
-      <w:r>
-        <w:t xml:space="preserve">Abran Proyecto final en el laboratorio, elijan este caso y llenen su ficha. La mesa ensayó. El proyecto es de cada persona. Tres a cinco minutos al frente.</w:t>
-      </w:r>
-    </w:p>
-    <w:p>
-      <w:r>
-        <w:t xml:space="preserve"/>
-      </w:r>
-    </w:p>
-    <w:p>
-      <w:r>
-        <w:t xml:space="preserve">Esto es de práctica. Planta Central, Lote Norte, Cliente Alfa. Nada de la empresa de verdad.</w:t>
+        <w:t xml:space="preserve">Datos de práctica: Planta Central, Lote Norte, Cliente Alfa. Nada de la empresa de verdad.</w:t>
       </w:r>
     </w:p>
   </w:body>

</xml_diff>